<commit_message>
Fix rename bulk : pattern [\s_]* pour underscore scinde dans
- Remplace _ par [\s_]* dans les patterns regex de renameVariable() et
  deleteVariables() pour matcher les variables dont l'underscore est
  perdu quand le contenu est decoupe entre plusieurs <w:t> dans le XML
  du .docx (ex: {{ CIVILITE }}{{ }} devient {{ CIVILITE ASSOCIE }})
- Supprime la valeur par defaut du prompt() de renommage en masse pour
  eviter que l'utilisateur clique OK sans modifier
- Ajoute sections TemplateAnalyzer, Analyse Couverture, DOCX Gotchas
  et XAMPP Debugging dans AGENTS.md
</commit_message>
<xml_diff>
--- a/templates/SARL AU/SARL-AU_2026-03_Contrat-Domiciliation_Template.docx
+++ b/templates/SARL AU/SARL-AU_2026-03_Contrat-Domiciliation_Template.docx
@@ -719,7 +719,7 @@
           <w:szCs w:val="14"/>
           <w:lang w:val="fr-FR"/>
         </w:rPr>
-        <w:t>ET, La   Société « {{ DENOMINATION_SOCIALE }} {{ FORME_JURIDIQUE }} », en   cours   de   formation, inscrite   à l’OMPIC  sous l’ICE N° {{ SOCIETE_ICE }}, représentée par son Gérant : </w:t>
+        <w:t>ET, La   Société « {{ SOCIETE_RAISON_SOCIALE }} {{ SOCIETE_FORME_JURIDIQUE }} », en   cours   de   formation, inscrite   à l’OMPIC  sous l’ICE N° {{ SOCIETE_ICE }}, représentée par son Gérant : </w:t>
       </w:r>
       <w:r>
         <w:rPr>
@@ -1111,7 +1111,7 @@
                 <w:szCs w:val="14"/>
                 <w:lang w:val="fr-FR"/>
               </w:rPr>
-              <w:t>{{ ASSOCIE_DATE_NAISSANCE }} à {{ LIEU_NAISSANCE_ASSOCIE }}</w:t>
+              <w:t>{{ ASSOCIE_DATE_NAISSANCE }} à {{ ASSOCIE_LIEU_NAISSANCE }}</w:t>
             </w:r>
             <w:proofErr w:type="gramEnd"/>
             <w:r>
@@ -3118,7 +3118,7 @@
           <w:szCs w:val="14"/>
           <w:lang w:val="fr-FR"/>
         </w:rPr>
-        <w:t xml:space="preserve">Pendant la période initiale prévue au contrat, le présent contrat de domiciliation est conclu moyennant un </w:t>
+        <w:t xml:space="preserve">Pendant la période initiale prévue au contrat, le présent contrat de domiciliation est conclu moyennant un pack de démarrage d’un montant total de {{ CONTRAT_PACK_MONTANT_TTC }} DH, soit un loyer mensuel de {{ CONTRAT_LOYER_HT }} DH. Ce montant couvre l’ensemble des prestations prévues à l’article 2 du présent contrat.</w:t>
       </w:r>
       <w:r>
         <w:rPr>
@@ -3127,15 +3127,15 @@
           <w:u w:val="single"/>
           <w:lang w:val="fr-FR"/>
         </w:rPr>
-        <w:t>pack de démarrage</w:t>
-      </w:r>
-      <w:r>
-        <w:rPr>
-          <w:sz w:val="14"/>
-          <w:szCs w:val="14"/>
-          <w:lang w:val="fr-FR"/>
-        </w:rPr>
-        <w:t xml:space="preserve"> d’un montant </w:t>
+        <w:t/>
+      </w:r>
+      <w:r>
+        <w:rPr>
+          <w:sz w:val="14"/>
+          <w:szCs w:val="14"/>
+          <w:lang w:val="fr-FR"/>
+        </w:rPr>
+        <w:t xml:space="preserve"/>
       </w:r>
       <w:r>
         <w:rPr>
@@ -3146,7 +3146,7 @@
           <w:szCs w:val="14"/>
           <w:lang w:val="fr-FR"/>
         </w:rPr>
-        <w:t>total de</w:t>
+        <w:t/>
       </w:r>
       <w:r>
         <w:rPr>
@@ -3157,7 +3157,7 @@
           <w:szCs w:val="14"/>
           <w:lang w:val="fr-FR"/>
         </w:rPr>
-        <w:t xml:space="preserve"> </w:t>
+        <w:t xml:space="preserve"/>
       </w:r>
       <w:proofErr w:type="gramStart"/>
       <w:r>
@@ -3169,7 +3169,7 @@
           <w:szCs w:val="14"/>
           <w:lang w:val="fr-FR"/>
         </w:rPr>
-        <w:t>{{ PACK</w:t>
+        <w:t/>
       </w:r>
       <w:proofErr w:type="gramEnd"/>
       <w:r>
@@ -3181,7 +3181,7 @@
           <w:szCs w:val="14"/>
           <w:lang w:val="fr-FR"/>
         </w:rPr>
-        <w:t>_DEMARRAGE_TOTAL_</w:t>
+        <w:t/>
       </w:r>
       <w:proofErr w:type="gramStart"/>
       <w:r>
@@ -3193,7 +3193,7 @@
           <w:szCs w:val="14"/>
           <w:lang w:val="fr-FR"/>
         </w:rPr>
-        <w:t>TTC</w:t>
+        <w:t/>
       </w:r>
       <w:r>
         <w:rPr>
@@ -3204,7 +3204,7 @@
           <w:szCs w:val="14"/>
           <w:lang w:val="fr-FR"/>
         </w:rPr>
-        <w:t xml:space="preserve"> </w:t>
+        <w:t xml:space="preserve"/>
       </w:r>
       <w:r>
         <w:rPr>
@@ -3215,7 +3215,7 @@
           <w:szCs w:val="14"/>
           <w:lang w:val="fr-FR"/>
         </w:rPr>
-        <w:t>}</w:t>
+        <w:t/>
       </w:r>
       <w:proofErr w:type="gramEnd"/>
       <w:r>
@@ -3227,7 +3227,7 @@
           <w:szCs w:val="14"/>
           <w:lang w:val="fr-FR"/>
         </w:rPr>
-        <w:t>} D</w:t>
+        <w:t/>
       </w:r>
       <w:r>
         <w:rPr>
@@ -3238,7 +3238,7 @@
           <w:szCs w:val="14"/>
           <w:lang w:val="fr-FR"/>
         </w:rPr>
-        <w:t>H</w:t>
+        <w:t/>
       </w:r>
       <w:r>
         <w:rPr>
@@ -3249,17 +3249,17 @@
           <w:szCs w:val="14"/>
           <w:lang w:val="fr-FR"/>
         </w:rPr>
-        <w:t>,</w:t>
-      </w:r>
-      <w:r>
-        <w:rPr>
-          <w:b/>
-          <w:bCs/>
-          <w:sz w:val="14"/>
-          <w:szCs w:val="14"/>
-          <w:lang w:val="fr-FR"/>
-        </w:rPr>
-        <w:t xml:space="preserve"> soit un </w:t>
+        <w:t/>
+      </w:r>
+      <w:r>
+        <w:rPr>
+          <w:b/>
+          <w:bCs/>
+          <w:sz w:val="14"/>
+          <w:szCs w:val="14"/>
+          <w:lang w:val="fr-FR"/>
+        </w:rPr>
+        <w:t xml:space="preserve"/>
       </w:r>
       <w:r>
         <w:rPr>
@@ -3270,7 +3270,7 @@
           <w:szCs w:val="14"/>
           <w:lang w:val="fr-FR"/>
         </w:rPr>
-        <w:t xml:space="preserve">loyer mensuel de </w:t>
+        <w:t xml:space="preserve"/>
       </w:r>
       <w:proofErr w:type="gramStart"/>
       <w:r>
@@ -3282,7 +3282,7 @@
           <w:szCs w:val="14"/>
           <w:lang w:val="fr-FR"/>
         </w:rPr>
-        <w:t>{{</w:t>
+        <w:t/>
       </w:r>
       <w:r>
         <w:rPr>
@@ -3293,7 +3293,7 @@
           <w:szCs w:val="14"/>
           <w:lang w:val="fr-FR"/>
         </w:rPr>
-        <w:t xml:space="preserve"> </w:t>
+        <w:t xml:space="preserve"/>
       </w:r>
       <w:r>
         <w:rPr>
@@ -3304,7 +3304,7 @@
           <w:szCs w:val="14"/>
           <w:lang w:val="fr-FR"/>
         </w:rPr>
-        <w:t>PACK</w:t>
+        <w:t/>
       </w:r>
       <w:proofErr w:type="gramEnd"/>
       <w:r>
@@ -3316,7 +3316,7 @@
           <w:szCs w:val="14"/>
           <w:lang w:val="fr-FR"/>
         </w:rPr>
-        <w:t>_DEMARRAGE_LOYER_</w:t>
+        <w:t/>
       </w:r>
       <w:proofErr w:type="gramStart"/>
       <w:r>
@@ -3328,7 +3328,7 @@
           <w:szCs w:val="14"/>
           <w:lang w:val="fr-FR"/>
         </w:rPr>
-        <w:t>MENSUEL }</w:t>
+        <w:t/>
       </w:r>
       <w:proofErr w:type="gramEnd"/>
       <w:r>
@@ -3340,7 +3340,7 @@
           <w:szCs w:val="14"/>
           <w:lang w:val="fr-FR"/>
         </w:rPr>
-        <w:t xml:space="preserve">} </w:t>
+        <w:t xml:space="preserve"/>
       </w:r>
       <w:r>
         <w:rPr>
@@ -3351,15 +3351,15 @@
           <w:szCs w:val="14"/>
           <w:lang w:val="fr-FR"/>
         </w:rPr>
-        <w:t xml:space="preserve">DH. </w:t>
-      </w:r>
-      <w:r>
-        <w:rPr>
-          <w:sz w:val="14"/>
-          <w:szCs w:val="14"/>
-          <w:lang w:val="fr-FR"/>
-        </w:rPr>
-        <w:t>Ce montant couvre l’ensemble des prestations prévues à l’article 2 du présent contrat.</w:t>
+        <w:t xml:space="preserve"/>
+      </w:r>
+      <w:r>
+        <w:rPr>
+          <w:sz w:val="14"/>
+          <w:szCs w:val="14"/>
+          <w:lang w:val="fr-FR"/>
+        </w:rPr>
+        <w:t/>
       </w:r>
     </w:p>
     <w:p>
@@ -3514,7 +3514,7 @@
           <w:szCs w:val="14"/>
           <w:lang w:val="fr-FR"/>
         </w:rPr>
-        <w:t xml:space="preserve">Le loyer de renouvellement est fixé à </w:t>
+        <w:t xml:space="preserve">Le loyer de renouvellement est fixé à {{ CONTRAT_RENOUV_LOYER_HT }} DH par mois, portant le montant annuel à {{ CONTRAT_RENOUV_ANNUEL_TTC }} DH.</w:t>
       </w:r>
       <w:proofErr w:type="gramStart"/>
       <w:r>
@@ -3526,7 +3526,7 @@
           <w:szCs w:val="14"/>
           <w:lang w:val="fr-FR"/>
         </w:rPr>
-        <w:t>{{ RENOUVELLEMENT</w:t>
+        <w:t/>
       </w:r>
       <w:proofErr w:type="gramEnd"/>
       <w:r>
@@ -3538,7 +3538,7 @@
           <w:szCs w:val="14"/>
           <w:lang w:val="fr-FR"/>
         </w:rPr>
-        <w:t>_LOYER_</w:t>
+        <w:t/>
       </w:r>
       <w:proofErr w:type="gramStart"/>
       <w:r>
@@ -3550,7 +3550,7 @@
           <w:szCs w:val="14"/>
           <w:lang w:val="fr-FR"/>
         </w:rPr>
-        <w:t>MENSUEL</w:t>
+        <w:t/>
       </w:r>
       <w:r>
         <w:rPr>
@@ -3561,7 +3561,7 @@
           <w:szCs w:val="14"/>
           <w:lang w:val="fr-FR"/>
         </w:rPr>
-        <w:t xml:space="preserve"> </w:t>
+        <w:t xml:space="preserve"/>
       </w:r>
       <w:r>
         <w:rPr>
@@ -3572,7 +3572,7 @@
           <w:szCs w:val="14"/>
           <w:lang w:val="fr-FR"/>
         </w:rPr>
-        <w:t>}</w:t>
+        <w:t/>
       </w:r>
       <w:proofErr w:type="gramEnd"/>
       <w:r>
@@ -3584,15 +3584,15 @@
           <w:szCs w:val="14"/>
           <w:lang w:val="fr-FR"/>
         </w:rPr>
-        <w:t>} DH</w:t>
-      </w:r>
-      <w:r>
-        <w:rPr>
-          <w:sz w:val="14"/>
-          <w:szCs w:val="14"/>
-          <w:lang w:val="fr-FR"/>
-        </w:rPr>
-        <w:t xml:space="preserve"> par mois, portant le montant annuel à </w:t>
+        <w:t/>
+      </w:r>
+      <w:r>
+        <w:rPr>
+          <w:sz w:val="14"/>
+          <w:szCs w:val="14"/>
+          <w:lang w:val="fr-FR"/>
+        </w:rPr>
+        <w:t xml:space="preserve"/>
       </w:r>
       <w:proofErr w:type="gramStart"/>
       <w:r>
@@ -3604,7 +3604,7 @@
           <w:szCs w:val="14"/>
           <w:lang w:val="fr-FR"/>
         </w:rPr>
-        <w:t>{{</w:t>
+        <w:t/>
       </w:r>
       <w:r>
         <w:rPr>
@@ -3615,7 +3615,7 @@
           <w:szCs w:val="14"/>
           <w:lang w:val="fr-FR"/>
         </w:rPr>
-        <w:t xml:space="preserve"> </w:t>
+        <w:t xml:space="preserve"/>
       </w:r>
       <w:r>
         <w:rPr>
@@ -3626,7 +3626,7 @@
           <w:szCs w:val="14"/>
           <w:lang w:val="fr-FR"/>
         </w:rPr>
-        <w:t>RENOUVELLEMENT</w:t>
+        <w:t/>
       </w:r>
       <w:proofErr w:type="gramEnd"/>
       <w:r>
@@ -3638,7 +3638,7 @@
           <w:szCs w:val="14"/>
           <w:lang w:val="fr-FR"/>
         </w:rPr>
-        <w:t>_LOYER_</w:t>
+        <w:t/>
       </w:r>
       <w:proofErr w:type="gramStart"/>
       <w:r>
@@ -3650,7 +3650,7 @@
           <w:szCs w:val="14"/>
           <w:lang w:val="fr-FR"/>
         </w:rPr>
-        <w:t>ANNUEL</w:t>
+        <w:t/>
       </w:r>
       <w:r>
         <w:rPr>
@@ -3661,7 +3661,7 @@
           <w:szCs w:val="14"/>
           <w:lang w:val="fr-FR"/>
         </w:rPr>
-        <w:t xml:space="preserve"> </w:t>
+        <w:t xml:space="preserve"/>
       </w:r>
       <w:r>
         <w:rPr>
@@ -3672,7 +3672,7 @@
           <w:szCs w:val="14"/>
           <w:lang w:val="fr-FR"/>
         </w:rPr>
-        <w:t>}</w:t>
+        <w:t/>
       </w:r>
       <w:proofErr w:type="gramEnd"/>
       <w:r>
@@ -3684,7 +3684,7 @@
           <w:szCs w:val="14"/>
           <w:lang w:val="fr-FR"/>
         </w:rPr>
-        <w:t>} DH</w:t>
+        <w:t/>
       </w:r>
       <w:r>
         <w:rPr>
@@ -3695,7 +3695,7 @@
           <w:szCs w:val="14"/>
           <w:lang w:val="fr-FR"/>
         </w:rPr>
-        <w:t>.</w:t>
+        <w:t/>
       </w:r>
     </w:p>
     <w:p>

</xml_diff>